<commit_message>
fix: shartnoma shabloni yangilandi (BLAGO->MY PERFEKT HOME, sanalar teglandi) + Aktdagi eski shartnoma raqami avtomat togrilanadi. Hujjat toza chiqadi
</commit_message>
<xml_diff>
--- a/resources/templates/shartnoma.docx
+++ b/resources/templates/shartnoma.docx
@@ -257,13 +257,6 @@
         <w:tab/>
       </w:r>
       <w:r>
-        <w:rPr>
-          <w:rFonts w:ascii="Courier New" w:hAnsi="Courier New" w:cs="Courier New"/>
-          <w:color w:val="8C8C8C"/>
-          <w:sz w:val="18"/>
-          <w:szCs w:val="18"/>
-          <w:shd w:val="clear" w:color="auto" w:fill="262626"/>
-        </w:rPr>
         <w:t>{sana}</w:t>
       </w:r>
       <w:r>
@@ -686,35 +679,12 @@
         <w:t xml:space="preserve"> </w:t>
       </w:r>
       <w:r>
-        <w:rPr>
-          <w:rFonts w:ascii="Courier New" w:hAnsi="Courier New" w:cs="Courier New"/>
-          <w:color w:val="8C8C8C"/>
-          <w:sz w:val="18"/>
-          <w:szCs w:val="18"/>
-          <w:shd w:val="clear" w:color="auto" w:fill="262626"/>
-        </w:rPr>
         <w:t>{ism}</w:t>
       </w:r>
       <w:r>
-        <w:rPr>
-          <w:rStyle w:val="apple-style-span"/>
-          <w:rFonts w:ascii="Times New Roman" w:hAnsi="Times New Roman"/>
-          <w:b/>
-          <w:color w:val="000000"/>
-          <w:sz w:val="20"/>
-          <w:szCs w:val="20"/>
-        </w:rPr>
         <w:t xml:space="preserve"> </w:t>
       </w:r>
       <w:r>
-        <w:rPr>
-          <w:rStyle w:val="apple-style-span"/>
-          <w:rFonts w:ascii="Times New Roman" w:hAnsi="Times New Roman"/>
-          <w:b/>
-          <w:color w:val="000000"/>
-          <w:sz w:val="20"/>
-          <w:szCs w:val="20"/>
-        </w:rPr>
         <w:t xml:space="preserve"> </w:t>
       </w:r>
       <w:r>
@@ -1167,37 +1137,10 @@
         <w:t>дресу</w:t>
       </w:r>
       <w:r>
-        <w:rPr>
-          <w:rStyle w:val="apple-style-span"/>
-          <w:rFonts w:ascii="Times New Roman" w:hAnsi="Times New Roman"/>
-          <w:b/>
-          <w:i/>
-          <w:color w:val="000000"/>
-          <w:sz w:val="20"/>
-          <w:szCs w:val="20"/>
-          <w:lang w:val="uz-Cyrl-UZ"/>
-        </w:rPr>
         <w:t xml:space="preserve"> </w:t>
       </w:r>
       <w:r>
-        <w:rPr>
-          <w:rFonts w:ascii="Courier New" w:hAnsi="Courier New" w:cs="Courier New"/>
-          <w:color w:val="8C8C8C"/>
-          <w:sz w:val="18"/>
-          <w:szCs w:val="18"/>
-          <w:shd w:val="clear" w:color="auto" w:fill="262626"/>
-        </w:rPr>
-        <w:t>{manzil}</w:t>
-      </w:r>
-      <w:r>
-        <w:rPr>
-          <w:rFonts w:ascii="Courier New" w:hAnsi="Courier New" w:cs="Courier New"/>
-          <w:color w:val="8C8C8C"/>
-          <w:sz w:val="18"/>
-          <w:szCs w:val="18"/>
-          <w:shd w:val="clear" w:color="auto" w:fill="262626"/>
-        </w:rPr>
-        <w:t xml:space="preserve"> </w:t>
+        <w:t xml:space="preserve">{manzil} </w:t>
       </w:r>
       <w:r>
         <w:rPr>
@@ -1580,14 +1523,13 @@
         <w:t xml:space="preserve"> </w:t>
       </w:r>
       <w:r>
-        <w:rPr>
-          <w:rFonts w:ascii="Courier New" w:hAnsi="Courier New" w:cs="Courier New"/>
-          <w:color w:val="8C8C8C"/>
-          <w:sz w:val="18"/>
-          <w:szCs w:val="18"/>
-          <w:shd w:val="clear" w:color="auto" w:fill="262626"/>
-        </w:rPr>
         <w:t>{narx}</w:t>
+      </w:r>
+      <w:r>
+        <w:t>. (</w:t>
+      </w:r>
+      <w:r>
+        <w:t>{narx_sozda}</w:t>
       </w:r>
       <w:r>
         <w:rPr>
@@ -1596,22 +1538,11 @@
           <w:bCs/>
           <w:i/>
           <w:iCs/>
-          <w:color w:val="FF0000"/>
           <w:sz w:val="20"/>
           <w:szCs w:val="20"/>
           <w:u w:val="single"/>
         </w:rPr>
-        <w:t>. (</w:t>
-      </w:r>
-      <w:r>
-        <w:rPr>
-          <w:rFonts w:ascii="Courier New" w:hAnsi="Courier New" w:cs="Courier New"/>
-          <w:color w:val="8C8C8C"/>
-          <w:sz w:val="18"/>
-          <w:szCs w:val="18"/>
-          <w:shd w:val="clear" w:color="auto" w:fill="262626"/>
-        </w:rPr>
-        <w:t>{narx_sozda}</w:t>
+        <w:t xml:space="preserve"> с </w:t>
       </w:r>
       <w:r>
         <w:rPr>
@@ -1623,8 +1554,9 @@
           <w:sz w:val="20"/>
           <w:szCs w:val="20"/>
           <w:u w:val="single"/>
-        </w:rPr>
-        <w:t xml:space="preserve">сум с </w:t>
+          <w:lang w:val="uz-Cyrl-UZ"/>
+        </w:rPr>
+        <w:t xml:space="preserve">БЕЗ </w:t>
       </w:r>
       <w:r>
         <w:rPr>
@@ -1636,11 +1568,15 @@
           <w:sz w:val="20"/>
           <w:szCs w:val="20"/>
           <w:u w:val="single"/>
-          <w:lang w:val="uz-Cyrl-UZ"/>
-        </w:rPr>
-        <w:t xml:space="preserve">БЕЗ </w:t>
-      </w:r>
-      <w:r>
+        </w:rPr>
+        <w:t>НДС).</w:t>
+      </w:r>
+    </w:p>
+    <w:p>
+      <w:pPr>
+        <w:spacing w:after="0"/>
+        <w:ind w:right="-284" w:firstLine="567"/>
+        <w:jc w:val="both"/>
         <w:rPr>
           <w:rFonts w:ascii="Times New Roman" w:hAnsi="Times New Roman"/>
           <w:b/>
@@ -1651,7 +1587,213 @@
           <w:szCs w:val="20"/>
           <w:u w:val="single"/>
         </w:rPr>
-        <w:t>НДС).</w:t>
+      </w:pPr>
+      <w:r>
+        <w:rPr>
+          <w:rStyle w:val="apple-style-span"/>
+          <w:rFonts w:ascii="Times New Roman" w:hAnsi="Times New Roman"/>
+          <w:sz w:val="20"/>
+          <w:szCs w:val="20"/>
+        </w:rPr>
+        <w:t>2</w:t>
+      </w:r>
+      <w:r>
+        <w:rPr>
+          <w:rStyle w:val="apple-style-span"/>
+          <w:rFonts w:ascii="Times New Roman" w:hAnsi="Times New Roman"/>
+          <w:sz w:val="20"/>
+          <w:szCs w:val="20"/>
+        </w:rPr>
+        <w:t>.</w:t>
+      </w:r>
+      <w:r>
+        <w:rPr>
+          <w:rStyle w:val="apple-style-span"/>
+          <w:rFonts w:ascii="Times New Roman" w:hAnsi="Times New Roman"/>
+          <w:sz w:val="20"/>
+          <w:szCs w:val="20"/>
+        </w:rPr>
+        <w:t>2</w:t>
+      </w:r>
+      <w:r>
+        <w:rPr>
+          <w:rStyle w:val="apple-style-span"/>
+          <w:rFonts w:ascii="Times New Roman" w:hAnsi="Times New Roman"/>
+          <w:sz w:val="20"/>
+          <w:szCs w:val="20"/>
+        </w:rPr>
+        <w:t>.</w:t>
+      </w:r>
+      <w:r>
+        <w:rPr>
+          <w:rStyle w:val="apple-style-span"/>
+          <w:rFonts w:ascii="Times New Roman" w:hAnsi="Times New Roman"/>
+          <w:sz w:val="20"/>
+          <w:szCs w:val="20"/>
+        </w:rPr>
+        <w:t xml:space="preserve"> За выполнение работ и</w:t>
+      </w:r>
+      <w:r>
+        <w:rPr>
+          <w:rStyle w:val="apple-style-span"/>
+          <w:rFonts w:ascii="Times New Roman" w:hAnsi="Times New Roman"/>
+          <w:sz w:val="20"/>
+          <w:szCs w:val="20"/>
+        </w:rPr>
+        <w:t xml:space="preserve"> </w:t>
+      </w:r>
+      <w:r>
+        <w:rPr>
+          <w:rStyle w:val="apple-style-span"/>
+          <w:rFonts w:ascii="Times New Roman" w:hAnsi="Times New Roman"/>
+          <w:sz w:val="20"/>
+          <w:szCs w:val="20"/>
+        </w:rPr>
+        <w:t xml:space="preserve">услуг, входящих в понятие научно-технической продукции согласно настоящего Договора </w:t>
+      </w:r>
+      <w:r>
+        <w:rPr>
+          <w:rStyle w:val="apple-style-span"/>
+          <w:rFonts w:ascii="Times New Roman" w:hAnsi="Times New Roman"/>
+          <w:b/>
+          <w:sz w:val="20"/>
+          <w:szCs w:val="20"/>
+        </w:rPr>
+        <w:t>«ЗАКАЗЧИК»</w:t>
+      </w:r>
+      <w:r>
+        <w:rPr>
+          <w:rStyle w:val="apple-style-span"/>
+          <w:rFonts w:ascii="Times New Roman" w:hAnsi="Times New Roman"/>
+          <w:sz w:val="20"/>
+          <w:szCs w:val="20"/>
+        </w:rPr>
+        <w:t xml:space="preserve"> </w:t>
+      </w:r>
+      <w:r>
+        <w:rPr>
+          <w:rStyle w:val="apple-style-span"/>
+          <w:rFonts w:ascii="Times New Roman" w:hAnsi="Times New Roman"/>
+          <w:sz w:val="20"/>
+          <w:szCs w:val="20"/>
+        </w:rPr>
+        <w:t>в течение</w:t>
+      </w:r>
+      <w:r>
+        <w:rPr>
+          <w:rStyle w:val="apple-style-span"/>
+          <w:rFonts w:ascii="Times New Roman" w:hAnsi="Times New Roman"/>
+          <w:sz w:val="20"/>
+          <w:szCs w:val="20"/>
+        </w:rPr>
+        <w:t xml:space="preserve"> </w:t>
+      </w:r>
+      <w:r>
+        <w:rPr>
+          <w:rStyle w:val="apple-style-span"/>
+          <w:rFonts w:ascii="Times New Roman" w:hAnsi="Times New Roman"/>
+          <w:sz w:val="20"/>
+          <w:szCs w:val="20"/>
+        </w:rPr>
+        <w:t>10</w:t>
+      </w:r>
+      <w:r>
+        <w:rPr>
+          <w:rStyle w:val="apple-style-span"/>
+          <w:rFonts w:ascii="Times New Roman" w:hAnsi="Times New Roman"/>
+          <w:sz w:val="20"/>
+          <w:szCs w:val="20"/>
+        </w:rPr>
+        <w:t>-х банковских</w:t>
+      </w:r>
+      <w:r>
+        <w:rPr>
+          <w:rStyle w:val="apple-style-span"/>
+          <w:rFonts w:ascii="Times New Roman" w:hAnsi="Times New Roman"/>
+          <w:sz w:val="20"/>
+          <w:szCs w:val="20"/>
+        </w:rPr>
+        <w:t xml:space="preserve"> </w:t>
+      </w:r>
+      <w:r>
+        <w:rPr>
+          <w:rStyle w:val="apple-style-span"/>
+          <w:rFonts w:ascii="Times New Roman" w:hAnsi="Times New Roman"/>
+          <w:sz w:val="20"/>
+          <w:szCs w:val="20"/>
+        </w:rPr>
+        <w:t xml:space="preserve">дней </w:t>
+      </w:r>
+      <w:r>
+        <w:rPr>
+          <w:rStyle w:val="apple-style-span"/>
+          <w:rFonts w:ascii="Times New Roman" w:hAnsi="Times New Roman"/>
+          <w:sz w:val="20"/>
+          <w:szCs w:val="20"/>
+        </w:rPr>
+        <w:t xml:space="preserve">перечисляет </w:t>
+      </w:r>
+      <w:r>
+        <w:rPr>
+          <w:rStyle w:val="apple-style-span"/>
+          <w:rFonts w:ascii="Times New Roman" w:hAnsi="Times New Roman"/>
+          <w:b/>
+          <w:sz w:val="20"/>
+          <w:szCs w:val="20"/>
+        </w:rPr>
+        <w:t>«ИСПОЛНИТЕЛЮ»</w:t>
+      </w:r>
+      <w:r>
+        <w:rPr>
+          <w:rStyle w:val="apple-style-span"/>
+          <w:rFonts w:ascii="Times New Roman" w:hAnsi="Times New Roman"/>
+          <w:sz w:val="20"/>
+          <w:szCs w:val="20"/>
+        </w:rPr>
+        <w:t xml:space="preserve"> в соответствии с Протоколом соглашения о договорной цене </w:t>
+      </w:r>
+      <w:r>
+        <w:t>{narx}. ({narx_sozda}</w:t>
+      </w:r>
+      <w:r>
+        <w:rPr>
+          <w:rFonts w:ascii="Times New Roman" w:hAnsi="Times New Roman"/>
+          <w:b/>
+          <w:bCs/>
+          <w:i/>
+          <w:iCs/>
+          <w:sz w:val="20"/>
+          <w:szCs w:val="20"/>
+          <w:u w:val="single"/>
+        </w:rPr>
+        <w:t xml:space="preserve"> с</w:t>
+      </w:r>
+      <w:r>
+        <w:rPr>
+          <w:rFonts w:ascii="Times New Roman" w:hAnsi="Times New Roman"/>
+          <w:b/>
+          <w:bCs/>
+          <w:i/>
+          <w:iCs/>
+          <w:sz w:val="20"/>
+          <w:szCs w:val="20"/>
+          <w:u w:val="single"/>
+          <w:lang w:val="uz-Cyrl-UZ"/>
+        </w:rPr>
+        <w:t xml:space="preserve"> БЕЗ</w:t>
+      </w:r>
+      <w:r>
+        <w:rPr>
+          <w:rFonts w:ascii="Times New Roman" w:hAnsi="Times New Roman"/>
+          <w:b/>
+          <w:bCs/>
+          <w:i/>
+          <w:iCs/>
+          <w:sz w:val="20"/>
+          <w:szCs w:val="20"/>
+          <w:u w:val="single"/>
+        </w:rPr>
+        <w:t xml:space="preserve"> НДС</w:t>
       </w:r>
     </w:p>
     <w:p>
@@ -1660,6 +1802,28 @@
         <w:ind w:right="-284" w:firstLine="567"/>
         <w:jc w:val="both"/>
         <w:rPr>
+          <w:rStyle w:val="apple-style-span"/>
+          <w:rFonts w:ascii="Times New Roman" w:hAnsi="Times New Roman"/>
+          <w:sz w:val="20"/>
+          <w:szCs w:val="20"/>
+        </w:rPr>
+      </w:pPr>
+      <w:r>
+        <w:rPr>
+          <w:rStyle w:val="apple-style-span"/>
+          <w:rFonts w:ascii="Times New Roman" w:hAnsi="Times New Roman"/>
+          <w:sz w:val="20"/>
+          <w:szCs w:val="20"/>
+        </w:rPr>
+        <w:t>Протокол соглашения о договорной цене является неотъемлемой частью настоящего договора.</w:t>
+      </w:r>
+    </w:p>
+    <w:p>
+      <w:pPr>
+        <w:spacing w:after="0"/>
+        <w:ind w:right="-284" w:firstLine="567"/>
+        <w:jc w:val="both"/>
+        <w:rPr>
           <w:rFonts w:ascii="Times New Roman" w:hAnsi="Times New Roman"/>
           <w:b/>
           <w:bCs/>
@@ -1677,43 +1841,99 @@
           <w:sz w:val="20"/>
           <w:szCs w:val="20"/>
         </w:rPr>
-        <w:t>2</w:t>
-      </w:r>
-      <w:r>
-        <w:rPr>
-          <w:rStyle w:val="apple-style-span"/>
-          <w:rFonts w:ascii="Times New Roman" w:hAnsi="Times New Roman"/>
-          <w:sz w:val="20"/>
-          <w:szCs w:val="20"/>
-        </w:rPr>
-        <w:t>.</w:t>
-      </w:r>
-      <w:r>
-        <w:rPr>
-          <w:rStyle w:val="apple-style-span"/>
-          <w:rFonts w:ascii="Times New Roman" w:hAnsi="Times New Roman"/>
-          <w:sz w:val="20"/>
-          <w:szCs w:val="20"/>
-        </w:rPr>
-        <w:t>2</w:t>
-      </w:r>
-      <w:r>
-        <w:rPr>
-          <w:rStyle w:val="apple-style-span"/>
-          <w:rFonts w:ascii="Times New Roman" w:hAnsi="Times New Roman"/>
-          <w:sz w:val="20"/>
-          <w:szCs w:val="20"/>
-        </w:rPr>
-        <w:t>.</w:t>
-      </w:r>
-      <w:r>
-        <w:rPr>
-          <w:rStyle w:val="apple-style-span"/>
-          <w:rFonts w:ascii="Times New Roman" w:hAnsi="Times New Roman"/>
-          <w:sz w:val="20"/>
-          <w:szCs w:val="20"/>
-        </w:rPr>
-        <w:t xml:space="preserve"> За выполнение работ и</w:t>
+        <w:t xml:space="preserve">2.3. </w:t>
+      </w:r>
+      <w:r>
+        <w:rPr>
+          <w:rStyle w:val="apple-style-span"/>
+          <w:rFonts w:ascii="Times New Roman" w:hAnsi="Times New Roman"/>
+          <w:sz w:val="20"/>
+          <w:szCs w:val="20"/>
+        </w:rPr>
+        <w:t>«</w:t>
+      </w:r>
+      <w:r>
+        <w:rPr>
+          <w:rStyle w:val="apple-style-span"/>
+          <w:rFonts w:ascii="Times New Roman" w:hAnsi="Times New Roman"/>
+          <w:b/>
+          <w:sz w:val="20"/>
+          <w:szCs w:val="20"/>
+        </w:rPr>
+        <w:t>ЗАКАЗЧИК»</w:t>
+      </w:r>
+      <w:r>
+        <w:rPr>
+          <w:rStyle w:val="apple-style-span"/>
+          <w:rFonts w:ascii="Times New Roman" w:hAnsi="Times New Roman"/>
+          <w:sz w:val="20"/>
+          <w:szCs w:val="20"/>
+        </w:rPr>
+        <w:t xml:space="preserve"> обязуется</w:t>
+      </w:r>
+      <w:r>
+        <w:rPr>
+          <w:rStyle w:val="apple-style-span"/>
+          <w:rFonts w:ascii="Times New Roman" w:hAnsi="Times New Roman"/>
+          <w:sz w:val="20"/>
+          <w:szCs w:val="20"/>
+        </w:rPr>
+        <w:t xml:space="preserve"> в 10-дневный срок после подписания договора произвести авансовую предоплату на р/счет </w:t>
+      </w:r>
+      <w:r>
+        <w:rPr>
+          <w:rStyle w:val="apple-style-span"/>
+          <w:rFonts w:ascii="Times New Roman" w:hAnsi="Times New Roman"/>
+          <w:b/>
+          <w:sz w:val="20"/>
+          <w:szCs w:val="20"/>
+        </w:rPr>
+        <w:t>«ИСПОЛНИТЕЛЯ»</w:t>
+      </w:r>
+      <w:r>
+        <w:rPr>
+          <w:rStyle w:val="apple-style-span"/>
+          <w:rFonts w:ascii="Times New Roman" w:hAnsi="Times New Roman"/>
+          <w:sz w:val="20"/>
+          <w:szCs w:val="20"/>
+        </w:rPr>
+        <w:t xml:space="preserve"> в размере </w:t>
+      </w:r>
+      <w:r>
+        <w:rPr>
+          <w:rStyle w:val="apple-style-span"/>
+          <w:rFonts w:ascii="Times New Roman" w:hAnsi="Times New Roman"/>
+          <w:sz w:val="20"/>
+          <w:szCs w:val="20"/>
+        </w:rPr>
+        <w:t>10</w:t>
+      </w:r>
+      <w:r>
+        <w:rPr>
+          <w:rStyle w:val="apple-style-span"/>
+          <w:rFonts w:ascii="Times New Roman" w:hAnsi="Times New Roman"/>
+          <w:sz w:val="20"/>
+          <w:szCs w:val="20"/>
+        </w:rPr>
+        <w:t xml:space="preserve">0% от </w:t>
+      </w:r>
+      <w:r>
+        <w:rPr>
+          <w:rStyle w:val="apple-style-span"/>
+          <w:rFonts w:ascii="Times New Roman" w:hAnsi="Times New Roman"/>
+          <w:sz w:val="20"/>
+          <w:szCs w:val="20"/>
+        </w:rPr>
+        <w:t>суммы Договора</w:t>
+      </w:r>
+      <w:r>
+        <w:rPr>
+          <w:rStyle w:val="apple-style-span"/>
+          <w:rFonts w:ascii="Times New Roman" w:hAnsi="Times New Roman"/>
+          <w:sz w:val="20"/>
+          <w:szCs w:val="20"/>
+        </w:rPr>
+        <w:t>,</w:t>
       </w:r>
       <w:r>
         <w:rPr>
@@ -1731,118 +1951,10 @@
           <w:sz w:val="20"/>
           <w:szCs w:val="20"/>
         </w:rPr>
-        <w:t xml:space="preserve">услуг, входящих в понятие научно-технической продукции согласно настоящего Договора </w:t>
-      </w:r>
-      <w:r>
-        <w:rPr>
-          <w:rStyle w:val="apple-style-span"/>
-          <w:rFonts w:ascii="Times New Roman" w:hAnsi="Times New Roman"/>
-          <w:b/>
-          <w:sz w:val="20"/>
-          <w:szCs w:val="20"/>
-        </w:rPr>
-        <w:t>«ЗАКАЗЧИК»</w:t>
-      </w:r>
-      <w:r>
-        <w:rPr>
-          <w:rStyle w:val="apple-style-span"/>
-          <w:rFonts w:ascii="Times New Roman" w:hAnsi="Times New Roman"/>
-          <w:sz w:val="20"/>
-          <w:szCs w:val="20"/>
-        </w:rPr>
-        <w:t xml:space="preserve"> </w:t>
-      </w:r>
-      <w:r>
-        <w:rPr>
-          <w:rStyle w:val="apple-style-span"/>
-          <w:rFonts w:ascii="Times New Roman" w:hAnsi="Times New Roman"/>
-          <w:sz w:val="20"/>
-          <w:szCs w:val="20"/>
-        </w:rPr>
-        <w:t>в течение</w:t>
-      </w:r>
-      <w:r>
-        <w:rPr>
-          <w:rStyle w:val="apple-style-span"/>
-          <w:rFonts w:ascii="Times New Roman" w:hAnsi="Times New Roman"/>
-          <w:sz w:val="20"/>
-          <w:szCs w:val="20"/>
-        </w:rPr>
-        <w:t xml:space="preserve"> </w:t>
-      </w:r>
-      <w:r>
-        <w:rPr>
-          <w:rStyle w:val="apple-style-span"/>
-          <w:rFonts w:ascii="Times New Roman" w:hAnsi="Times New Roman"/>
-          <w:sz w:val="20"/>
-          <w:szCs w:val="20"/>
-        </w:rPr>
-        <w:t>10</w:t>
-      </w:r>
-      <w:r>
-        <w:rPr>
-          <w:rStyle w:val="apple-style-span"/>
-          <w:rFonts w:ascii="Times New Roman" w:hAnsi="Times New Roman"/>
-          <w:sz w:val="20"/>
-          <w:szCs w:val="20"/>
-        </w:rPr>
-        <w:t>-х банковских</w:t>
-      </w:r>
-      <w:r>
-        <w:rPr>
-          <w:rStyle w:val="apple-style-span"/>
-          <w:rFonts w:ascii="Times New Roman" w:hAnsi="Times New Roman"/>
-          <w:sz w:val="20"/>
-          <w:szCs w:val="20"/>
-        </w:rPr>
-        <w:t xml:space="preserve"> </w:t>
-      </w:r>
-      <w:r>
-        <w:rPr>
-          <w:rStyle w:val="apple-style-span"/>
-          <w:rFonts w:ascii="Times New Roman" w:hAnsi="Times New Roman"/>
-          <w:sz w:val="20"/>
-          <w:szCs w:val="20"/>
-        </w:rPr>
-        <w:t xml:space="preserve">дней </w:t>
-      </w:r>
-      <w:r>
-        <w:rPr>
-          <w:rStyle w:val="apple-style-span"/>
-          <w:rFonts w:ascii="Times New Roman" w:hAnsi="Times New Roman"/>
-          <w:sz w:val="20"/>
-          <w:szCs w:val="20"/>
-        </w:rPr>
-        <w:t xml:space="preserve">перечисляет </w:t>
-      </w:r>
-      <w:r>
-        <w:rPr>
-          <w:rStyle w:val="apple-style-span"/>
-          <w:rFonts w:ascii="Times New Roman" w:hAnsi="Times New Roman"/>
-          <w:b/>
-          <w:sz w:val="20"/>
-          <w:szCs w:val="20"/>
-        </w:rPr>
-        <w:t>«ИСПОЛНИТЕЛЮ»</w:t>
-      </w:r>
-      <w:r>
-        <w:rPr>
-          <w:rStyle w:val="apple-style-span"/>
-          <w:rFonts w:ascii="Times New Roman" w:hAnsi="Times New Roman"/>
-          <w:sz w:val="20"/>
-          <w:szCs w:val="20"/>
-        </w:rPr>
-        <w:t xml:space="preserve"> в соответствии с Протоколом соглашения о договорной цене </w:t>
-      </w:r>
-      <w:r>
-        <w:rPr>
-          <w:rFonts w:ascii="Courier New" w:hAnsi="Courier New" w:cs="Courier New"/>
-          <w:color w:val="8C8C8C"/>
-          <w:sz w:val="18"/>
-          <w:szCs w:val="18"/>
-          <w:shd w:val="clear" w:color="auto" w:fill="262626"/>
-        </w:rPr>
-        <w:t>{narx}</w:t>
+        <w:t xml:space="preserve">что </w:t>
+      </w:r>
+      <w:r>
+        <w:t>{narx}. ({narx_sozda}</w:t>
       </w:r>
       <w:r>
         <w:rPr>
@@ -1851,267 +1963,11 @@
           <w:bCs/>
           <w:i/>
           <w:iCs/>
-          <w:color w:val="FF0000"/>
           <w:sz w:val="20"/>
           <w:szCs w:val="20"/>
           <w:u w:val="single"/>
         </w:rPr>
-        <w:t>. (</w:t>
-      </w:r>
-      <w:r>
-        <w:rPr>
-          <w:rFonts w:ascii="Courier New" w:hAnsi="Courier New" w:cs="Courier New"/>
-          <w:color w:val="8C8C8C"/>
-          <w:sz w:val="18"/>
-          <w:szCs w:val="18"/>
-          <w:shd w:val="clear" w:color="auto" w:fill="262626"/>
-        </w:rPr>
-        <w:t>{narx_sozda}</w:t>
-      </w:r>
-      <w:r>
-        <w:rPr>
-          <w:rFonts w:ascii="Times New Roman" w:hAnsi="Times New Roman"/>
-          <w:b/>
-          <w:bCs/>
-          <w:i/>
-          <w:iCs/>
-          <w:sz w:val="20"/>
-          <w:szCs w:val="20"/>
-          <w:u w:val="single"/>
-        </w:rPr>
-        <w:t>сум с</w:t>
-      </w:r>
-      <w:r>
-        <w:rPr>
-          <w:rFonts w:ascii="Times New Roman" w:hAnsi="Times New Roman"/>
-          <w:b/>
-          <w:bCs/>
-          <w:i/>
-          <w:iCs/>
-          <w:sz w:val="20"/>
-          <w:szCs w:val="20"/>
-          <w:u w:val="single"/>
-          <w:lang w:val="uz-Cyrl-UZ"/>
-        </w:rPr>
-        <w:t xml:space="preserve"> БЕЗ</w:t>
-      </w:r>
-      <w:r>
-        <w:rPr>
-          <w:rFonts w:ascii="Times New Roman" w:hAnsi="Times New Roman"/>
-          <w:b/>
-          <w:bCs/>
-          <w:i/>
-          <w:iCs/>
-          <w:sz w:val="20"/>
-          <w:szCs w:val="20"/>
-          <w:u w:val="single"/>
-        </w:rPr>
-        <w:t xml:space="preserve"> НДС</w:t>
-      </w:r>
-    </w:p>
-    <w:p>
-      <w:pPr>
-        <w:spacing w:after="0"/>
-        <w:ind w:right="-284" w:firstLine="567"/>
-        <w:jc w:val="both"/>
-        <w:rPr>
-          <w:rStyle w:val="apple-style-span"/>
-          <w:rFonts w:ascii="Times New Roman" w:hAnsi="Times New Roman"/>
-          <w:sz w:val="20"/>
-          <w:szCs w:val="20"/>
-        </w:rPr>
-      </w:pPr>
-      <w:r>
-        <w:rPr>
-          <w:rStyle w:val="apple-style-span"/>
-          <w:rFonts w:ascii="Times New Roman" w:hAnsi="Times New Roman"/>
-          <w:sz w:val="20"/>
-          <w:szCs w:val="20"/>
-        </w:rPr>
-        <w:t>Протокол соглашения о договорной цене является неотъемлемой частью настоящего договора.</w:t>
-      </w:r>
-    </w:p>
-    <w:p>
-      <w:pPr>
-        <w:spacing w:after="0"/>
-        <w:ind w:right="-284" w:firstLine="567"/>
-        <w:jc w:val="both"/>
-        <w:rPr>
-          <w:rFonts w:ascii="Times New Roman" w:hAnsi="Times New Roman"/>
-          <w:b/>
-          <w:bCs/>
-          <w:i/>
-          <w:iCs/>
-          <w:sz w:val="20"/>
-          <w:szCs w:val="20"/>
-          <w:u w:val="single"/>
-        </w:rPr>
-      </w:pPr>
-      <w:r>
-        <w:rPr>
-          <w:rStyle w:val="apple-style-span"/>
-          <w:rFonts w:ascii="Times New Roman" w:hAnsi="Times New Roman"/>
-          <w:sz w:val="20"/>
-          <w:szCs w:val="20"/>
-        </w:rPr>
-        <w:t xml:space="preserve">2.3. </w:t>
-      </w:r>
-      <w:r>
-        <w:rPr>
-          <w:rStyle w:val="apple-style-span"/>
-          <w:rFonts w:ascii="Times New Roman" w:hAnsi="Times New Roman"/>
-          <w:sz w:val="20"/>
-          <w:szCs w:val="20"/>
-        </w:rPr>
-        <w:t>«</w:t>
-      </w:r>
-      <w:r>
-        <w:rPr>
-          <w:rStyle w:val="apple-style-span"/>
-          <w:rFonts w:ascii="Times New Roman" w:hAnsi="Times New Roman"/>
-          <w:b/>
-          <w:sz w:val="20"/>
-          <w:szCs w:val="20"/>
-        </w:rPr>
-        <w:t>ЗАКАЗЧИК»</w:t>
-      </w:r>
-      <w:r>
-        <w:rPr>
-          <w:rStyle w:val="apple-style-span"/>
-          <w:rFonts w:ascii="Times New Roman" w:hAnsi="Times New Roman"/>
-          <w:sz w:val="20"/>
-          <w:szCs w:val="20"/>
-        </w:rPr>
-        <w:t xml:space="preserve"> обязуется</w:t>
-      </w:r>
-      <w:r>
-        <w:rPr>
-          <w:rStyle w:val="apple-style-span"/>
-          <w:rFonts w:ascii="Times New Roman" w:hAnsi="Times New Roman"/>
-          <w:sz w:val="20"/>
-          <w:szCs w:val="20"/>
-        </w:rPr>
-        <w:t xml:space="preserve"> в 10-дневный срок после подписания договора произвести авансовую предоплату на р/счет </w:t>
-      </w:r>
-      <w:r>
-        <w:rPr>
-          <w:rStyle w:val="apple-style-span"/>
-          <w:rFonts w:ascii="Times New Roman" w:hAnsi="Times New Roman"/>
-          <w:b/>
-          <w:sz w:val="20"/>
-          <w:szCs w:val="20"/>
-        </w:rPr>
-        <w:t>«ИСПОЛНИТЕЛЯ»</w:t>
-      </w:r>
-      <w:r>
-        <w:rPr>
-          <w:rStyle w:val="apple-style-span"/>
-          <w:rFonts w:ascii="Times New Roman" w:hAnsi="Times New Roman"/>
-          <w:sz w:val="20"/>
-          <w:szCs w:val="20"/>
-        </w:rPr>
-        <w:t xml:space="preserve"> в размере </w:t>
-      </w:r>
-      <w:r>
-        <w:rPr>
-          <w:rStyle w:val="apple-style-span"/>
-          <w:rFonts w:ascii="Times New Roman" w:hAnsi="Times New Roman"/>
-          <w:sz w:val="20"/>
-          <w:szCs w:val="20"/>
-        </w:rPr>
-        <w:t>10</w:t>
-      </w:r>
-      <w:r>
-        <w:rPr>
-          <w:rStyle w:val="apple-style-span"/>
-          <w:rFonts w:ascii="Times New Roman" w:hAnsi="Times New Roman"/>
-          <w:sz w:val="20"/>
-          <w:szCs w:val="20"/>
-        </w:rPr>
-        <w:t xml:space="preserve">0% от </w:t>
-      </w:r>
-      <w:r>
-        <w:rPr>
-          <w:rStyle w:val="apple-style-span"/>
-          <w:rFonts w:ascii="Times New Roman" w:hAnsi="Times New Roman"/>
-          <w:sz w:val="20"/>
-          <w:szCs w:val="20"/>
-        </w:rPr>
-        <w:t>суммы Договора</w:t>
-      </w:r>
-      <w:r>
-        <w:rPr>
-          <w:rStyle w:val="apple-style-span"/>
-          <w:rFonts w:ascii="Times New Roman" w:hAnsi="Times New Roman"/>
-          <w:sz w:val="20"/>
-          <w:szCs w:val="20"/>
-        </w:rPr>
-        <w:t>,</w:t>
-      </w:r>
-      <w:r>
-        <w:rPr>
-          <w:rStyle w:val="apple-style-span"/>
-          <w:rFonts w:ascii="Times New Roman" w:hAnsi="Times New Roman"/>
-          <w:sz w:val="20"/>
-          <w:szCs w:val="20"/>
-        </w:rPr>
-        <w:t xml:space="preserve"> </w:t>
-      </w:r>
-      <w:r>
-        <w:rPr>
-          <w:rStyle w:val="apple-style-span"/>
-          <w:rFonts w:ascii="Times New Roman" w:hAnsi="Times New Roman"/>
-          <w:sz w:val="20"/>
-          <w:szCs w:val="20"/>
-        </w:rPr>
-        <w:t xml:space="preserve">что </w:t>
-      </w:r>
-      <w:r>
-        <w:rPr>
-          <w:rFonts w:ascii="Courier New" w:hAnsi="Courier New" w:cs="Courier New"/>
-          <w:color w:val="8C8C8C"/>
-          <w:sz w:val="18"/>
-          <w:szCs w:val="18"/>
-          <w:shd w:val="clear" w:color="auto" w:fill="262626"/>
-        </w:rPr>
-        <w:t>{narx}</w:t>
-      </w:r>
-      <w:r>
-        <w:rPr>
-          <w:rFonts w:ascii="Times New Roman" w:hAnsi="Times New Roman"/>
-          <w:b/>
-          <w:bCs/>
-          <w:i/>
-          <w:iCs/>
-          <w:color w:val="FF0000"/>
-          <w:sz w:val="20"/>
-          <w:szCs w:val="20"/>
-          <w:u w:val="single"/>
-        </w:rPr>
-        <w:t>. (</w:t>
-      </w:r>
-      <w:r>
-        <w:rPr>
-          <w:rFonts w:ascii="Courier New" w:hAnsi="Courier New" w:cs="Courier New"/>
-          <w:color w:val="8C8C8C"/>
-          <w:sz w:val="18"/>
-          <w:szCs w:val="18"/>
-          <w:shd w:val="clear" w:color="auto" w:fill="262626"/>
-        </w:rPr>
-        <w:t>{narx_sozda}</w:t>
-      </w:r>
-      <w:r>
-        <w:rPr>
-          <w:rFonts w:ascii="Times New Roman" w:hAnsi="Times New Roman"/>
-          <w:b/>
-          <w:bCs/>
-          <w:i/>
-          <w:iCs/>
-          <w:sz w:val="20"/>
-          <w:szCs w:val="20"/>
-          <w:u w:val="single"/>
-        </w:rPr>
-        <w:t>сум с</w:t>
+        <w:t xml:space="preserve"> с</w:t>
       </w:r>
       <w:r>
         <w:rPr>
@@ -5019,71 +4875,14 @@
             </w:r>
           </w:p>
           <w:p>
-            <w:pPr>
-              <w:tabs>
-                <w:tab w:val="left" w:pos="6209"/>
-              </w:tabs>
-              <w:spacing w:after="0"/>
-              <w:ind w:right="-284"/>
-              <w:rPr>
-                <w:rStyle w:val="apple-style-span"/>
-                <w:rFonts w:ascii="Times New Roman" w:hAnsi="Times New Roman"/>
-                <w:color w:val="FF0000"/>
-                <w:sz w:val="20"/>
-                <w:szCs w:val="20"/>
-              </w:rPr>
-            </w:pPr>
-            <w:r>
-              <w:rPr>
-                <w:rFonts w:ascii="Courier New" w:hAnsi="Courier New" w:cs="Courier New"/>
-                <w:color w:val="8C8C8C"/>
-                <w:sz w:val="18"/>
-                <w:szCs w:val="18"/>
-                <w:shd w:val="clear" w:color="auto" w:fill="262626"/>
-              </w:rPr>
+            <w:r>
               <w:t>{ism}</w:t>
             </w:r>
             <w:r>
-              <w:rPr>
-                <w:rStyle w:val="apple-style-span"/>
-                <w:rFonts w:ascii="Times New Roman" w:hAnsi="Times New Roman"/>
-                <w:b/>
-                <w:color w:val="FF0000"/>
-                <w:sz w:val="20"/>
-                <w:szCs w:val="20"/>
-              </w:rPr>
-              <w:t xml:space="preserve">  </w:t>
-            </w:r>
-            <w:r>
-              <w:rPr>
-                <w:rStyle w:val="apple-style-span"/>
-                <w:rFonts w:ascii="Times New Roman" w:hAnsi="Times New Roman"/>
-                <w:color w:val="FF0000"/>
-                <w:sz w:val="20"/>
-                <w:szCs w:val="20"/>
-              </w:rPr>
-              <w:t xml:space="preserve"> </w:t>
-            </w:r>
-            <w:r>
-              <w:rPr>
-                <w:rStyle w:val="apple-style-span"/>
-                <w:rFonts w:ascii="Times New Roman" w:hAnsi="Times New Roman"/>
-                <w:b/>
-                <w:color w:val="FF0000"/>
-                <w:sz w:val="20"/>
-                <w:szCs w:val="20"/>
-              </w:rPr>
               <w:t xml:space="preserve">   </w:t>
             </w:r>
             <w:r>
-              <w:rPr>
-                <w:rStyle w:val="apple-style-span"/>
-                <w:rFonts w:ascii="Times New Roman" w:hAnsi="Times New Roman"/>
-                <w:color w:val="FF0000"/>
-                <w:sz w:val="20"/>
-                <w:szCs w:val="20"/>
-              </w:rPr>
-              <w:t xml:space="preserve"> </w:t>
+              <w:t xml:space="preserve">    </w:t>
             </w:r>
           </w:p>
           <w:p>
@@ -5142,13 +4941,6 @@
               <w:t xml:space="preserve"> </w:t>
             </w:r>
             <w:r>
-              <w:rPr>
-                <w:rFonts w:ascii="Courier New" w:hAnsi="Courier New" w:cs="Courier New"/>
-                <w:color w:val="8C8C8C"/>
-                <w:sz w:val="18"/>
-                <w:szCs w:val="18"/>
-                <w:shd w:val="clear" w:color="auto" w:fill="262626"/>
-              </w:rPr>
               <w:t>{pasport}</w:t>
             </w:r>
             <w:r>
@@ -5210,13 +5002,6 @@
               <w:t xml:space="preserve"> </w:t>
             </w:r>
             <w:r>
-              <w:rPr>
-                <w:rFonts w:ascii="Courier New" w:hAnsi="Courier New" w:cs="Courier New"/>
-                <w:color w:val="8C8C8C"/>
-                <w:sz w:val="18"/>
-                <w:szCs w:val="18"/>
-                <w:shd w:val="clear" w:color="auto" w:fill="262626"/>
-              </w:rPr>
               <w:t>{berilgan}</w:t>
             </w:r>
           </w:p>
@@ -5253,13 +5038,6 @@
               <w:t xml:space="preserve">ПИНФЛ </w:t>
             </w:r>
             <w:r>
-              <w:rPr>
-                <w:rFonts w:ascii="Courier New" w:hAnsi="Courier New" w:cs="Courier New"/>
-                <w:color w:val="8C8C8C"/>
-                <w:sz w:val="18"/>
-                <w:szCs w:val="18"/>
-                <w:shd w:val="clear" w:color="auto" w:fill="262626"/>
-              </w:rPr>
               <w:t>{pinfl}</w:t>
             </w:r>
           </w:p>
@@ -5366,14 +5144,10 @@
               <w:t xml:space="preserve"> </w:t>
             </w:r>
             <w:r>
-              <w:rPr>
-                <w:rFonts w:ascii="Courier New" w:hAnsi="Courier New" w:cs="Courier New"/>
-                <w:color w:val="8C8C8C"/>
-                <w:sz w:val="18"/>
-                <w:szCs w:val="18"/>
-                <w:shd w:val="clear" w:color="auto" w:fill="262626"/>
-              </w:rPr>
               <w:t>{ism}</w:t>
+            </w:r>
+            <w:r>
+              <w:t>__________</w:t>
             </w:r>
             <w:r>
               <w:rPr>
@@ -5382,7 +5156,7 @@
                 <w:sz w:val="21"/>
                 <w:szCs w:val="21"/>
               </w:rPr>
-              <w:t>__________М.П.</w:t>
+              <w:t>М.П.</w:t>
             </w:r>
           </w:p>
         </w:tc>
@@ -5593,12 +5367,6 @@
       <w:pPr>
         <w:spacing w:after="0" w:line="240" w:lineRule="auto"/>
         <w:jc w:val="center"/>
-        <w:rPr>
-          <w:rStyle w:val="apple-style-span"/>
-          <w:color w:val="000000"/>
-          <w:sz w:val="20"/>
-          <w:szCs w:val="20"/>
-        </w:rPr>
       </w:pPr>
       <w:r>
         <w:rPr>
@@ -5637,34 +5405,17 @@
           <w:lang w:eastAsia="ru-RU"/>
         </w:rPr>
         <w:br/>
+      </w:r>
+      <w:r>
         <w:t>{raqam}</w:t>
       </w:r>
       <w:r>
-        <w:rPr>
-          <w:rStyle w:val="apple-style-span"/>
-          <w:color w:val="000000"/>
-          <w:sz w:val="20"/>
-          <w:szCs w:val="20"/>
-        </w:rPr>
         <w:t xml:space="preserve"> от </w:t>
       </w:r>
       <w:r>
-        <w:rPr>
-          <w:rFonts w:ascii="Courier New" w:hAnsi="Courier New" w:cs="Courier New"/>
-          <w:color w:val="8C8C8C"/>
-          <w:sz w:val="18"/>
-          <w:szCs w:val="18"/>
-          <w:shd w:val="clear" w:color="auto" w:fill="262626"/>
-        </w:rPr>
         <w:t>{sana}</w:t>
       </w:r>
       <w:r>
-        <w:rPr>
-          <w:rStyle w:val="apple-style-span"/>
-          <w:color w:val="000000"/>
-          <w:sz w:val="20"/>
-          <w:szCs w:val="20"/>
-        </w:rPr>
         <w:t>г.</w:t>
       </w:r>
     </w:p>
@@ -5686,146 +5437,138 @@
       <w:pPr>
         <w:spacing w:after="0"/>
         <w:jc w:val="center"/>
-        <w:rPr>
-          <w:rStyle w:val="apple-style-span"/>
+      </w:pPr>
+      <w:r>
+        <w:rPr>
+          <w:rStyle w:val="apple-style-span"/>
+          <w:color w:val="000000"/>
+        </w:rPr>
+        <w:t xml:space="preserve">        </w:t>
+      </w:r>
+      <w:r>
+        <w:rPr>
+          <w:rStyle w:val="apple-style-span"/>
+          <w:color w:val="000000"/>
+        </w:rPr>
+        <w:t xml:space="preserve">  </w:t>
+      </w:r>
+      <w:r>
+        <w:rPr>
+          <w:rStyle w:val="apple-style-span"/>
+          <w:color w:val="000000"/>
+        </w:rPr>
+        <w:t>Мы, нижеподписавшиеся, представитель “Исполител</w:t>
+      </w:r>
+      <w:r>
+        <w:rPr>
+          <w:rStyle w:val="apple-style-span"/>
+          <w:color w:val="000000"/>
+        </w:rPr>
+        <w:t>ь</w:t>
+      </w:r>
+      <w:r>
+        <w:rPr>
+          <w:rStyle w:val="apple-style-span"/>
+          <w:color w:val="000000"/>
+        </w:rPr>
+        <w:t>” Директор</w:t>
+      </w:r>
+      <w:r>
+        <w:rPr>
+          <w:rStyle w:val="apple-style-span"/>
+          <w:color w:val="000000"/>
+        </w:rPr>
+        <w:t xml:space="preserve"> </w:t>
+      </w:r>
+      <w:r>
+        <w:rPr>
+          <w:rStyle w:val="apple-style-span"/>
+          <w:color w:val="000000"/>
+          <w:lang w:val="uz-Cyrl-UZ"/>
+        </w:rPr>
+        <w:t>Турабеков.Н</w:t>
+      </w:r>
+      <w:r>
+        <w:rPr>
+          <w:rStyle w:val="apple-style-span"/>
+          <w:color w:val="000000"/>
+        </w:rPr>
+        <w:t>.Б</w:t>
+      </w:r>
+      <w:r>
+        <w:rPr>
+          <w:rStyle w:val="apple-style-span"/>
+          <w:color w:val="000000"/>
+        </w:rPr>
+        <w:t xml:space="preserve">. </w:t>
+      </w:r>
+      <w:r>
+        <w:rPr>
+          <w:b/>
+          <w:sz w:val="20"/>
+          <w:szCs w:val="20"/>
+        </w:rPr>
+        <w:t>ООО</w:t>
+      </w:r>
+      <w:r>
+        <w:rPr>
+          <w:b/>
+          <w:sz w:val="20"/>
+          <w:szCs w:val="20"/>
+        </w:rPr>
+        <w:t xml:space="preserve"> «</w:t>
+      </w:r>
+      <w:r>
+        <w:rPr>
+          <w:b/>
+          <w:sz w:val="20"/>
+          <w:szCs w:val="20"/>
+          <w:lang w:val="en-US"/>
+        </w:rPr>
+        <w:t>MY</w:t>
+      </w:r>
+      <w:r>
+        <w:rPr>
+          <w:b/>
+          <w:sz w:val="20"/>
+          <w:szCs w:val="20"/>
+        </w:rPr>
+        <w:t xml:space="preserve"> </w:t>
+      </w:r>
+      <w:r>
+        <w:rPr>
+          <w:b/>
+          <w:sz w:val="20"/>
+          <w:szCs w:val="20"/>
+          <w:lang w:val="en-US"/>
+        </w:rPr>
+        <w:t>PERFEKT</w:t>
+      </w:r>
+      <w:r>
+        <w:rPr>
+          <w:b/>
+          <w:sz w:val="20"/>
+          <w:szCs w:val="20"/>
+        </w:rPr>
+        <w:t xml:space="preserve"> </w:t>
+      </w:r>
+      <w:r>
+        <w:rPr>
+          <w:b/>
+          <w:sz w:val="20"/>
+          <w:szCs w:val="20"/>
+          <w:lang w:val="en-US"/>
+        </w:rPr>
+        <w:t>HOME</w:t>
+      </w:r>
+      <w:r>
+        <w:rPr>
           <w:rFonts w:ascii="Times New Roman" w:hAnsi="Times New Roman"/>
           <w:b/>
           <w:sz w:val="21"/>
           <w:szCs w:val="21"/>
           <w:lang w:bidi="en-US"/>
         </w:rPr>
-      </w:pPr>
-      <w:r>
-        <w:rPr>
-          <w:rStyle w:val="apple-style-span"/>
-          <w:color w:val="000000"/>
-        </w:rPr>
-        <w:t xml:space="preserve">        </w:t>
-      </w:r>
-      <w:r>
-        <w:rPr>
-          <w:rStyle w:val="apple-style-span"/>
-          <w:color w:val="000000"/>
-        </w:rPr>
-        <w:t xml:space="preserve">  </w:t>
-      </w:r>
-      <w:r>
-        <w:rPr>
-          <w:rStyle w:val="apple-style-span"/>
-          <w:color w:val="000000"/>
-        </w:rPr>
-        <w:t>Мы, нижеподписавшиеся, представитель “Исполител</w:t>
-      </w:r>
-      <w:r>
-        <w:rPr>
-          <w:rStyle w:val="apple-style-span"/>
-          <w:color w:val="000000"/>
-        </w:rPr>
-        <w:t>ь</w:t>
-      </w:r>
-      <w:r>
-        <w:rPr>
-          <w:rStyle w:val="apple-style-span"/>
-          <w:color w:val="000000"/>
-        </w:rPr>
-        <w:t>” Директор</w:t>
-      </w:r>
-      <w:r>
-        <w:rPr>
-          <w:rStyle w:val="apple-style-span"/>
-          <w:color w:val="000000"/>
-        </w:rPr>
-        <w:t xml:space="preserve"> </w:t>
-      </w:r>
-      <w:r>
-        <w:rPr>
-          <w:rStyle w:val="apple-style-span"/>
-          <w:color w:val="000000"/>
-          <w:lang w:val="uz-Cyrl-UZ"/>
-        </w:rPr>
-        <w:t>Турабеков.Н</w:t>
-      </w:r>
-      <w:r>
-        <w:rPr>
-          <w:rStyle w:val="apple-style-span"/>
-          <w:color w:val="000000"/>
-        </w:rPr>
-        <w:t>.Б</w:t>
-      </w:r>
-      <w:r>
-        <w:rPr>
-          <w:rStyle w:val="apple-style-span"/>
-          <w:color w:val="000000"/>
-        </w:rPr>
-        <w:t xml:space="preserve">. </w:t>
-      </w:r>
-      <w:r>
-        <w:rPr>
-          <w:b/>
-          <w:sz w:val="20"/>
-          <w:szCs w:val="20"/>
-        </w:rPr>
-        <w:t>ООО</w:t>
-      </w:r>
-      <w:r>
-        <w:rPr>
-          <w:b/>
-          <w:sz w:val="20"/>
-          <w:szCs w:val="20"/>
-        </w:rPr>
-        <w:t xml:space="preserve"> «</w:t>
-      </w:r>
-      <w:r>
-        <w:rPr>
-          <w:b/>
-          <w:sz w:val="20"/>
-          <w:szCs w:val="20"/>
-          <w:lang w:val="en-US"/>
-        </w:rPr>
-        <w:t>MY</w:t>
-      </w:r>
-      <w:r>
-        <w:rPr>
-          <w:b/>
-          <w:sz w:val="20"/>
-          <w:szCs w:val="20"/>
-        </w:rPr>
-        <w:t xml:space="preserve"> </w:t>
-      </w:r>
-      <w:r>
-        <w:rPr>
-          <w:b/>
-          <w:sz w:val="20"/>
-          <w:szCs w:val="20"/>
-          <w:lang w:val="en-US"/>
-        </w:rPr>
-        <w:t>PERFEKT</w:t>
-      </w:r>
-      <w:r>
-        <w:rPr>
-          <w:b/>
-          <w:sz w:val="20"/>
-          <w:szCs w:val="20"/>
-        </w:rPr>
-        <w:t xml:space="preserve"> </w:t>
-      </w:r>
-      <w:r>
-        <w:rPr>
-          <w:b/>
-          <w:sz w:val="20"/>
-          <w:szCs w:val="20"/>
-          <w:lang w:val="en-US"/>
-        </w:rPr>
-        <w:t>HOME</w:t>
-      </w:r>
-      <w:r>
-        <w:rPr>
-          <w:rFonts w:ascii="Times New Roman" w:hAnsi="Times New Roman"/>
-          <w:b/>
-          <w:sz w:val="21"/>
-          <w:szCs w:val="21"/>
-          <w:lang w:bidi="en-US"/>
-        </w:rPr>
         <w:t>»</w:t>
       </w:r>
       <w:r>
@@ -5853,57 +5596,10 @@
         <w:t xml:space="preserve">” </w:t>
       </w:r>
       <w:r>
-        <w:rPr>
-          <w:rFonts w:ascii="Courier New" w:hAnsi="Courier New" w:cs="Courier New"/>
-          <w:color w:val="8C8C8C"/>
-          <w:sz w:val="18"/>
-          <w:szCs w:val="18"/>
-          <w:shd w:val="clear" w:color="auto" w:fill="262626"/>
-        </w:rPr>
         <w:t>{ism}</w:t>
       </w:r>
       <w:r>
-        <w:rPr>
-          <w:rStyle w:val="apple-style-span"/>
-          <w:rFonts w:ascii="Times New Roman" w:hAnsi="Times New Roman"/>
-          <w:b/>
-          <w:color w:val="000000"/>
-          <w:sz w:val="20"/>
-          <w:szCs w:val="20"/>
-        </w:rPr>
-        <w:t xml:space="preserve"> </w:t>
-      </w:r>
-      <w:r>
-        <w:rPr>
-          <w:rStyle w:val="apple-style-span"/>
-          <w:rFonts w:ascii="Times New Roman" w:hAnsi="Times New Roman"/>
-          <w:b/>
-          <w:color w:val="000000"/>
-          <w:sz w:val="20"/>
-          <w:szCs w:val="20"/>
-        </w:rPr>
-        <w:t xml:space="preserve"> </w:t>
-      </w:r>
-      <w:r>
-        <w:rPr>
-          <w:rStyle w:val="apple-style-span"/>
-          <w:rFonts w:ascii="Times New Roman" w:hAnsi="Times New Roman"/>
-          <w:b/>
-          <w:color w:val="000000"/>
-          <w:sz w:val="20"/>
-          <w:szCs w:val="20"/>
-        </w:rPr>
-        <w:t xml:space="preserve"> </w:t>
-      </w:r>
-      <w:r>
-        <w:rPr>
-          <w:rStyle w:val="apple-style-span"/>
-          <w:rFonts w:ascii="Times New Roman" w:hAnsi="Times New Roman"/>
-          <w:color w:val="000000"/>
-          <w:sz w:val="20"/>
-          <w:szCs w:val="20"/>
-        </w:rPr>
-        <w:t xml:space="preserve"> </w:t>
+        <w:t xml:space="preserve">    </w:t>
       </w:r>
     </w:p>
     <w:p>
@@ -5913,12 +5609,6 @@
         </w:tabs>
         <w:spacing w:after="0"/>
         <w:ind w:right="-284"/>
-        <w:rPr>
-          <w:rStyle w:val="apple-style-span"/>
-          <w:color w:val="000000"/>
-          <w:sz w:val="20"/>
-          <w:szCs w:val="20"/>
-        </w:rPr>
       </w:pPr>
       <w:r>
         <w:rPr>
@@ -5956,14 +5646,7 @@
         <w:t xml:space="preserve"> </w:t>
       </w:r>
       <w:r>
-        <w:rPr>
-          <w:rFonts w:ascii="Courier New" w:hAnsi="Courier New" w:cs="Courier New"/>
-          <w:color w:val="8C8C8C"/>
-          <w:sz w:val="18"/>
-          <w:szCs w:val="18"/>
-          <w:shd w:val="clear" w:color="auto" w:fill="262626"/>
-        </w:rPr>
-        <w:t>{narx}</w:t>
+        <w:t>{narx}_</w:t>
       </w:r>
       <w:r>
         <w:rPr>
@@ -5977,20 +5660,11 @@
           <w:szCs w:val="20"/>
           <w:u w:val="single"/>
         </w:rPr>
-        <w:t>_ сум. (</w:t>
-      </w:r>
-      <w:r>
-        <w:rPr>
-          <w:rFonts w:ascii="Courier New" w:hAnsi="Courier New" w:cs="Courier New"/>
-          <w:color w:val="8C8C8C"/>
-          <w:sz w:val="18"/>
-          <w:szCs w:val="18"/>
-          <w:shd w:val="clear" w:color="auto" w:fill="262626"/>
-        </w:rPr>
-        <w:t>{narx_sozda}</w:t>
-      </w:r>
-      <w:bookmarkStart w:id="0" w:name="_GoBack"/>
-      <w:bookmarkEnd w:id="0"/>
+        <w:t xml:space="preserve"> </w:t>
+      </w:r>
+      <w:r>
+        <w:t>сум</w:t>
+      </w:r>
       <w:r>
         <w:rPr>
           <w:rFonts w:ascii="Times New Roman" w:hAnsi="Times New Roman"/>
@@ -6003,7 +5677,13 @@
           <w:szCs w:val="20"/>
           <w:u w:val="single"/>
         </w:rPr>
-        <w:t xml:space="preserve"> сум</w:t>
+        <w:t xml:space="preserve">. </w:t>
+      </w:r>
+      <w:r>
+        <w:t>({narx_sozda}</w:t>
+      </w:r>
+      <w:r>
+        <w:t xml:space="preserve"> </w:t>
       </w:r>
       <w:r>
         <w:rPr>
@@ -6015,8 +5695,9 @@
           <w:sz w:val="20"/>
           <w:szCs w:val="20"/>
           <w:u w:val="single"/>
-        </w:rPr>
-        <w:t xml:space="preserve"> </w:t>
+          <w:lang w:val="uz-Cyrl-UZ"/>
+        </w:rPr>
+        <w:t>БЕЗ</w:t>
       </w:r>
       <w:r>
         <w:rPr>
@@ -6028,20 +5709,6 @@
           <w:sz w:val="20"/>
           <w:szCs w:val="20"/>
           <w:u w:val="single"/>
-          <w:lang w:val="uz-Cyrl-UZ"/>
-        </w:rPr>
-        <w:t>БЕЗ</w:t>
-      </w:r>
-      <w:r>
-        <w:rPr>
-          <w:rFonts w:ascii="Times New Roman" w:hAnsi="Times New Roman"/>
-          <w:b/>
-          <w:bCs/>
-          <w:i/>
-          <w:iCs/>
-          <w:sz w:val="20"/>
-          <w:szCs w:val="20"/>
-          <w:u w:val="single"/>
         </w:rPr>
         <w:t xml:space="preserve"> НДС</w:t>
       </w:r>
@@ -6088,31 +5755,7 @@
         <w:t xml:space="preserve"> </w:t>
       </w:r>
       <w:r>
-        <w:rPr>
-          <w:rStyle w:val="apple-style-span"/>
-          <w:color w:val="000000"/>
-          <w:sz w:val="20"/>
-          <w:szCs w:val="20"/>
-        </w:rPr>
-        <w:t>№456</w:t>
-      </w:r>
-      <w:r>
-        <w:rPr>
-          <w:rStyle w:val="apple-style-span"/>
-          <w:color w:val="000000"/>
-          <w:sz w:val="20"/>
-          <w:szCs w:val="20"/>
-        </w:rPr>
-        <w:t>/09</w:t>
-      </w:r>
-      <w:r>
-        <w:rPr>
-          <w:rStyle w:val="apple-style-span"/>
-          <w:color w:val="000000"/>
-          <w:sz w:val="20"/>
-          <w:szCs w:val="20"/>
-        </w:rPr>
-        <w:t>-24</w:t>
+        <w:t>{raqam}</w:t>
       </w:r>
       <w:r>
         <w:rPr>
@@ -6124,50 +5767,13 @@
         <w:t xml:space="preserve"> от </w:t>
       </w:r>
       <w:r>
-        <w:rPr>
-          <w:rStyle w:val="apple-style-span"/>
-          <w:color w:val="000000"/>
-          <w:sz w:val="20"/>
-          <w:szCs w:val="20"/>
-        </w:rPr>
-        <w:t>09</w:t>
-      </w:r>
-      <w:r>
-        <w:rPr>
-          <w:rStyle w:val="apple-style-span"/>
-          <w:color w:val="000000"/>
-          <w:sz w:val="20"/>
-          <w:szCs w:val="20"/>
-        </w:rPr>
-        <w:t>.</w:t>
-      </w:r>
-      <w:r>
-        <w:rPr>
-          <w:rStyle w:val="apple-style-span"/>
-          <w:color w:val="000000"/>
-          <w:sz w:val="20"/>
-          <w:szCs w:val="20"/>
-          <w:lang w:val="uz-Cyrl-UZ"/>
-        </w:rPr>
-        <w:t>12</w:t>
-      </w:r>
-      <w:r>
-        <w:rPr>
-          <w:rStyle w:val="apple-style-span"/>
-          <w:color w:val="000000"/>
-          <w:sz w:val="20"/>
-          <w:szCs w:val="20"/>
-        </w:rPr>
-        <w:t>.2024</w:t>
-      </w:r>
-      <w:r>
-        <w:rPr>
-          <w:rStyle w:val="apple-style-span"/>
-          <w:color w:val="000000"/>
-          <w:sz w:val="20"/>
-          <w:szCs w:val="20"/>
-        </w:rPr>
-        <w:t xml:space="preserve"> г.</w:t>
+        <w:t>{sana}</w:t>
+      </w:r>
+      <w:r>
+        <w:t xml:space="preserve"> </w:t>
+      </w:r>
+      <w:r>
+        <w:t>г.</w:t>
       </w:r>
     </w:p>
     <w:p>
@@ -6225,66 +5831,16 @@
         <w:t xml:space="preserve"> </w:t>
       </w:r>
       <w:r>
-        <w:rPr>
-          <w:rFonts w:ascii="Courier New" w:hAnsi="Courier New" w:cs="Courier New"/>
-          <w:color w:val="8C8C8C"/>
-          <w:sz w:val="18"/>
-          <w:szCs w:val="18"/>
-          <w:shd w:val="clear" w:color="auto" w:fill="262626"/>
-        </w:rPr>
         <w:t>{narx}</w:t>
       </w:r>
       <w:r>
-        <w:rPr>
-          <w:rFonts w:ascii="Times New Roman" w:hAnsi="Times New Roman"/>
-          <w:b/>
-          <w:bCs/>
-          <w:i/>
-          <w:iCs/>
-          <w:color w:val="FF0000"/>
-          <w:sz w:val="20"/>
-          <w:szCs w:val="20"/>
-          <w:u w:val="single"/>
-        </w:rPr>
         <w:t xml:space="preserve">_ сум. </w:t>
       </w:r>
       <w:r>
-        <w:rPr>
-          <w:rFonts w:ascii="Times New Roman" w:hAnsi="Times New Roman"/>
-          <w:b/>
-          <w:bCs/>
-          <w:i/>
-          <w:iCs/>
-          <w:color w:val="FF0000"/>
-          <w:sz w:val="20"/>
-          <w:szCs w:val="20"/>
-          <w:u w:val="single"/>
-        </w:rPr>
         <w:t>(</w:t>
       </w:r>
       <w:r>
-        <w:rPr>
-          <w:rFonts w:ascii="Courier New" w:hAnsi="Courier New" w:cs="Courier New"/>
-          <w:color w:val="8C8C8C"/>
-          <w:sz w:val="18"/>
-          <w:szCs w:val="18"/>
-          <w:shd w:val="clear" w:color="auto" w:fill="262626"/>
-        </w:rPr>
         <w:t>{narx_sozda}</w:t>
-      </w:r>
-      <w:r>
-        <w:rPr>
-          <w:rFonts w:ascii="Times New Roman" w:hAnsi="Times New Roman"/>
-          <w:b/>
-          <w:bCs/>
-          <w:i/>
-          <w:iCs/>
-          <w:color w:val="FF0000"/>
-          <w:sz w:val="20"/>
-          <w:szCs w:val="20"/>
-          <w:u w:val="single"/>
-        </w:rPr>
-        <w:t>сум</w:t>
       </w:r>
       <w:r>
         <w:rPr>
@@ -6387,7 +5943,6 @@
           <w:color w:val="000000"/>
           <w:sz w:val="20"/>
           <w:szCs w:val="20"/>
-          <w:lang w:val="en-US"/>
         </w:rPr>
       </w:pPr>
     </w:p>
@@ -6846,15 +6401,6 @@
         </w:tabs>
         <w:spacing w:after="0"/>
         <w:ind w:right="-284"/>
-        <w:rPr>
-          <w:rStyle w:val="apple-style-span"/>
-          <w:rFonts w:ascii="Times New Roman" w:hAnsi="Times New Roman"/>
-          <w:b/>
-          <w:color w:val="FF0000"/>
-          <w:sz w:val="20"/>
-          <w:szCs w:val="20"/>
-          <w:lang w:val="uz-Cyrl-UZ"/>
-        </w:rPr>
       </w:pPr>
       <w:r>
         <w:rPr>
@@ -6914,25 +6460,12 @@
         <w:t xml:space="preserve"> </w:t>
       </w:r>
       <w:r>
-        <w:rPr>
-          <w:rFonts w:ascii="Times New Roman" w:hAnsi="Times New Roman"/>
-        </w:rPr>
         <w:t>_____</w:t>
       </w:r>
       <w:r>
-        <w:rPr>
-          <w:rFonts w:ascii="Times New Roman" w:hAnsi="Times New Roman"/>
-        </w:rPr>
         <w:t>______</w:t>
       </w:r>
       <w:r>
-        <w:rPr>
-          <w:rFonts w:ascii="Courier New" w:hAnsi="Courier New" w:cs="Courier New"/>
-          <w:color w:val="8C8C8C"/>
-          <w:sz w:val="18"/>
-          <w:szCs w:val="18"/>
-          <w:shd w:val="clear" w:color="auto" w:fill="262626"/>
-        </w:rPr>
         <w:t>{ism}</w:t>
       </w:r>
     </w:p>
@@ -7486,7 +7019,6 @@
           <w:szCs w:val="20"/>
           <w:lang w:val="uz-Cyrl-UZ"/>
         </w:rPr>
-        <w:lastRenderedPageBreak/>
         <w:t xml:space="preserve">   </w:t>
       </w:r>
     </w:p>
@@ -7513,6 +7045,7 @@
           <w:szCs w:val="20"/>
           <w:lang w:val="uz-Cyrl-UZ"/>
         </w:rPr>
+        <w:lastRenderedPageBreak/>
         <w:t xml:space="preserve">  </w:t>
       </w:r>
       <w:r>
@@ -7838,14 +7371,10 @@
         <w:t xml:space="preserve">                                                              </w:t>
       </w:r>
       <w:r>
-        <w:rPr>
-          <w:rFonts w:ascii="Courier New" w:hAnsi="Courier New" w:cs="Courier New"/>
-          <w:color w:val="8C8C8C"/>
-          <w:sz w:val="18"/>
-          <w:szCs w:val="18"/>
-          <w:shd w:val="clear" w:color="auto" w:fill="262626"/>
-        </w:rPr>
         <w:t>{sana}</w:t>
+      </w:r>
+      <w:r>
+        <w:t xml:space="preserve"> </w:t>
       </w:r>
       <w:r>
         <w:rPr>
@@ -7912,33 +7441,10 @@
         <w:t xml:space="preserve"> от </w:t>
       </w:r>
       <w:r>
-        <w:rPr>
-          <w:rFonts w:ascii="Courier New" w:hAnsi="Courier New" w:cs="Courier New"/>
-          <w:color w:val="8C8C8C"/>
-          <w:sz w:val="18"/>
-          <w:szCs w:val="18"/>
-          <w:shd w:val="clear" w:color="auto" w:fill="262626"/>
-        </w:rPr>
         <w:t>{sana}</w:t>
       </w:r>
       <w:r>
-        <w:rPr>
-          <w:rStyle w:val="apple-style-span"/>
-          <w:color w:val="000000"/>
-          <w:sz w:val="20"/>
-          <w:szCs w:val="20"/>
-          <w:highlight w:val="yellow"/>
-        </w:rPr>
-        <w:t>г</w:t>
-      </w:r>
-      <w:r>
-        <w:rPr>
-          <w:rStyle w:val="apple-style-span"/>
-          <w:color w:val="000000"/>
-          <w:sz w:val="20"/>
-          <w:szCs w:val="20"/>
-        </w:rPr>
-        <w:t>.</w:t>
+        <w:t>г.</w:t>
       </w:r>
     </w:p>
     <w:p>
@@ -8515,15 +8021,17 @@
               </w:tabs>
               <w:spacing w:after="0"/>
               <w:ind w:right="-284"/>
+            </w:pPr>
+            <w:r>
               <w:rPr>
                 <w:rStyle w:val="apple-style-span"/>
                 <w:rFonts w:ascii="Times New Roman" w:hAnsi="Times New Roman"/>
-                <w:b/>
                 <w:color w:val="000000"/>
                 <w:sz w:val="20"/>
                 <w:szCs w:val="20"/>
               </w:rPr>
-            </w:pPr>
+              <w:t>Паспорт</w:t>
+            </w:r>
             <w:r>
               <w:rPr>
                 <w:rStyle w:val="apple-style-span"/>
@@ -8532,7 +8040,7 @@
                 <w:sz w:val="20"/>
                 <w:szCs w:val="20"/>
               </w:rPr>
-              <w:t>Паспорт</w:t>
+              <w:t xml:space="preserve"> </w:t>
             </w:r>
             <w:r>
               <w:rPr>
@@ -8542,7 +8050,7 @@
                 <w:sz w:val="20"/>
                 <w:szCs w:val="20"/>
               </w:rPr>
-              <w:t xml:space="preserve"> </w:t>
+              <w:t>серия</w:t>
             </w:r>
             <w:r>
               <w:rPr>
@@ -8552,7 +8060,13 @@
                 <w:sz w:val="20"/>
                 <w:szCs w:val="20"/>
               </w:rPr>
-              <w:t>серия</w:t>
+              <w:t xml:space="preserve"> </w:t>
+            </w:r>
+            <w:r>
+              <w:t>{pasport}</w:t>
+            </w:r>
+            <w:r>
+              <w:br/>
             </w:r>
             <w:r>
               <w:rPr>
@@ -8566,24 +8080,13 @@
             </w:r>
             <w:r>
               <w:rPr>
-                <w:rFonts w:ascii="Courier New" w:hAnsi="Courier New" w:cs="Courier New"/>
-                <w:color w:val="8C8C8C"/>
-                <w:sz w:val="18"/>
-                <w:szCs w:val="18"/>
-                <w:shd w:val="clear" w:color="auto" w:fill="262626"/>
-              </w:rPr>
-              <w:t>{pasport}</w:t>
-            </w:r>
-            <w:r>
-              <w:rPr>
                 <w:rStyle w:val="apple-style-span"/>
                 <w:rFonts w:ascii="Times New Roman" w:hAnsi="Times New Roman"/>
                 <w:color w:val="000000"/>
                 <w:sz w:val="20"/>
                 <w:szCs w:val="20"/>
               </w:rPr>
-              <w:br/>
-              <w:t xml:space="preserve"> </w:t>
+              <w:t>выдан</w:t>
             </w:r>
             <w:r>
               <w:rPr>
@@ -8592,8 +8095,9 @@
                 <w:color w:val="000000"/>
                 <w:sz w:val="20"/>
                 <w:szCs w:val="20"/>
-              </w:rPr>
-              <w:t>выдан</w:t>
+                <w:lang w:val="uz-Cyrl-UZ"/>
+              </w:rPr>
+              <w:t xml:space="preserve"> </w:t>
             </w:r>
             <w:r>
               <w:rPr>
@@ -8602,28 +8106,10 @@
                 <w:color w:val="000000"/>
                 <w:sz w:val="20"/>
                 <w:szCs w:val="20"/>
-                <w:lang w:val="uz-Cyrl-UZ"/>
               </w:rPr>
               <w:t xml:space="preserve"> </w:t>
             </w:r>
             <w:r>
-              <w:rPr>
-                <w:rStyle w:val="apple-style-span"/>
-                <w:rFonts w:ascii="Times New Roman" w:hAnsi="Times New Roman"/>
-                <w:color w:val="000000"/>
-                <w:sz w:val="20"/>
-                <w:szCs w:val="20"/>
-              </w:rPr>
-              <w:t xml:space="preserve"> </w:t>
-            </w:r>
-            <w:r>
-              <w:rPr>
-                <w:rFonts w:ascii="Courier New" w:hAnsi="Courier New" w:cs="Courier New"/>
-                <w:color w:val="8C8C8C"/>
-                <w:sz w:val="18"/>
-                <w:szCs w:val="18"/>
-                <w:shd w:val="clear" w:color="auto" w:fill="262626"/>
-              </w:rPr>
               <w:t>{berilgan}</w:t>
             </w:r>
           </w:p>
@@ -8660,13 +8146,6 @@
               <w:t xml:space="preserve">ПИНФЛ </w:t>
             </w:r>
             <w:r>
-              <w:rPr>
-                <w:rFonts w:ascii="Courier New" w:hAnsi="Courier New" w:cs="Courier New"/>
-                <w:color w:val="8C8C8C"/>
-                <w:sz w:val="18"/>
-                <w:szCs w:val="18"/>
-                <w:shd w:val="clear" w:color="auto" w:fill="262626"/>
-              </w:rPr>
               <w:t>{pinfl}</w:t>
             </w:r>
           </w:p>
@@ -9373,13 +8852,6 @@
               <w:t xml:space="preserve"> По адресу Ташкентском области  Қуйичирчикском районе </w:t>
             </w:r>
             <w:r>
-              <w:rPr>
-                <w:rFonts w:ascii="Courier New" w:hAnsi="Courier New" w:cs="Courier New"/>
-                <w:color w:val="8C8C8C"/>
-                <w:sz w:val="18"/>
-                <w:szCs w:val="18"/>
-                <w:shd w:val="clear" w:color="auto" w:fill="262626"/>
-              </w:rPr>
               <w:t>{manzil}</w:t>
             </w:r>
           </w:p>
@@ -9462,26 +8934,7 @@
             <w:vAlign w:val="center"/>
           </w:tcPr>
           <w:p>
-            <w:pPr>
-              <w:spacing w:after="0"/>
-              <w:jc w:val="center"/>
-              <w:rPr>
-                <w:rFonts w:ascii="Times New Roman" w:hAnsi="Times New Roman"/>
-                <w:b/>
-                <w:i/>
-                <w:color w:val="FF0000"/>
-                <w:sz w:val="18"/>
-                <w:szCs w:val="20"/>
-              </w:rPr>
-            </w:pPr>
-            <w:r>
-              <w:rPr>
-                <w:rFonts w:ascii="Courier New" w:hAnsi="Courier New" w:cs="Courier New"/>
-                <w:color w:val="8C8C8C"/>
-                <w:sz w:val="18"/>
-                <w:szCs w:val="18"/>
-                <w:shd w:val="clear" w:color="auto" w:fill="262626"/>
-              </w:rPr>
+            <w:r>
               <w:t>{narx}</w:t>
             </w:r>
           </w:p>
@@ -9493,27 +8946,7 @@
             <w:vAlign w:val="center"/>
           </w:tcPr>
           <w:p>
-            <w:pPr>
-              <w:spacing w:after="0"/>
-              <w:jc w:val="center"/>
-              <w:rPr>
-                <w:rFonts w:ascii="Times New Roman" w:hAnsi="Times New Roman"/>
-                <w:b/>
-                <w:i/>
-                <w:color w:val="FF0000"/>
-                <w:sz w:val="20"/>
-                <w:szCs w:val="20"/>
-                <w:lang w:val="uz-Cyrl-UZ"/>
-              </w:rPr>
-            </w:pPr>
-            <w:r>
-              <w:rPr>
-                <w:rFonts w:ascii="Courier New" w:hAnsi="Courier New" w:cs="Courier New"/>
-                <w:color w:val="8C8C8C"/>
-                <w:sz w:val="18"/>
-                <w:szCs w:val="18"/>
-                <w:shd w:val="clear" w:color="auto" w:fill="262626"/>
-              </w:rPr>
+            <w:r>
               <w:t>{narx}</w:t>
             </w:r>
           </w:p>
@@ -9655,28 +9088,7 @@
             <w:shd w:val="clear" w:color="auto" w:fill="auto"/>
           </w:tcPr>
           <w:p>
-            <w:pPr>
-              <w:tabs>
-                <w:tab w:val="left" w:pos="7147"/>
-              </w:tabs>
-              <w:spacing w:after="0"/>
-              <w:rPr>
-                <w:rFonts w:ascii="Times New Roman" w:hAnsi="Times New Roman"/>
-                <w:b/>
-                <w:i/>
-                <w:color w:val="FF0000"/>
-                <w:sz w:val="20"/>
-                <w:szCs w:val="20"/>
-              </w:rPr>
-            </w:pPr>
-            <w:r>
-              <w:rPr>
-                <w:rFonts w:ascii="Courier New" w:hAnsi="Courier New" w:cs="Courier New"/>
-                <w:color w:val="8C8C8C"/>
-                <w:sz w:val="18"/>
-                <w:szCs w:val="18"/>
-                <w:shd w:val="clear" w:color="auto" w:fill="262626"/>
-              </w:rPr>
+            <w:r>
               <w:t>{narx}</w:t>
             </w:r>
           </w:p>
@@ -9708,82 +9120,28 @@
           <w:sz w:val="20"/>
           <w:szCs w:val="20"/>
         </w:rPr>
-        <w:t>Сумма прописью</w:t>
-      </w:r>
-      <w:r>
-        <w:rPr>
-          <w:rFonts w:ascii="Times New Roman" w:hAnsi="Times New Roman"/>
-          <w:b/>
-          <w:bCs/>
-          <w:i/>
-          <w:iCs/>
-          <w:sz w:val="20"/>
-          <w:szCs w:val="20"/>
-          <w:u w:val="single"/>
-        </w:rPr>
+        <w:t xml:space="preserve">Сумма </w:t>
+      </w:r>
+      <w:r>
+        <w:t>прописью</w:t>
+      </w:r>
+      <w:r>
         <w:t xml:space="preserve"> </w:t>
       </w:r>
       <w:r>
-        <w:rPr>
-          <w:rFonts w:ascii="Courier New" w:hAnsi="Courier New" w:cs="Courier New"/>
-          <w:color w:val="8C8C8C"/>
-          <w:sz w:val="18"/>
-          <w:szCs w:val="18"/>
-          <w:shd w:val="clear" w:color="auto" w:fill="262626"/>
-        </w:rPr>
         <w:t>{narx}</w:t>
       </w:r>
       <w:r>
-        <w:rPr>
-          <w:rFonts w:ascii="Times New Roman" w:hAnsi="Times New Roman"/>
-          <w:b/>
-          <w:bCs/>
-          <w:i/>
-          <w:iCs/>
-          <w:color w:val="FF0000"/>
-          <w:sz w:val="20"/>
-          <w:szCs w:val="20"/>
-          <w:u w:val="single"/>
-        </w:rPr>
         <w:t xml:space="preserve">_ сум. </w:t>
       </w:r>
       <w:r>
-        <w:rPr>
-          <w:rFonts w:ascii="Times New Roman" w:hAnsi="Times New Roman"/>
-          <w:b/>
-          <w:bCs/>
-          <w:i/>
-          <w:iCs/>
-          <w:color w:val="FF0000"/>
-          <w:sz w:val="20"/>
-          <w:szCs w:val="20"/>
-          <w:u w:val="single"/>
-        </w:rPr>
         <w:t>(</w:t>
       </w:r>
       <w:r>
-        <w:rPr>
-          <w:rFonts w:ascii="Courier New" w:hAnsi="Courier New" w:cs="Courier New"/>
-          <w:color w:val="8C8C8C"/>
-          <w:sz w:val="18"/>
-          <w:szCs w:val="18"/>
-          <w:shd w:val="clear" w:color="auto" w:fill="262626"/>
-        </w:rPr>
         <w:t>{narx_sozda}</w:t>
       </w:r>
       <w:r>
-        <w:rPr>
-          <w:rFonts w:ascii="Times New Roman" w:hAnsi="Times New Roman"/>
-          <w:b/>
-          <w:bCs/>
-          <w:i/>
-          <w:iCs/>
-          <w:color w:val="FF0000"/>
-          <w:sz w:val="20"/>
-          <w:szCs w:val="20"/>
-          <w:u w:val="single"/>
-        </w:rPr>
-        <w:t>сум</w:t>
+        <w:t xml:space="preserve"> )</w:t>
       </w:r>
       <w:r>
         <w:rPr>
@@ -9938,73 +9296,27 @@
           <w:sz w:val="20"/>
           <w:szCs w:val="20"/>
         </w:rPr>
-        <w:t xml:space="preserve">к договору </w:t>
-      </w:r>
-      <w:r>
-        <w:rPr>
-          <w:rFonts w:ascii="Courier New" w:hAnsi="Courier New" w:cs="Courier New"/>
-          <w:color w:val="8C8C8C"/>
-          <w:sz w:val="18"/>
-          <w:szCs w:val="18"/>
-          <w:shd w:val="clear" w:color="auto" w:fill="262626"/>
-        </w:rPr>
-        <w:t>{raqam}</w:t>
-      </w:r>
-      <w:r>
-        <w:rPr>
-          <w:rFonts w:ascii="Courier New" w:hAnsi="Courier New" w:cs="Courier New"/>
-          <w:color w:val="8C8C8C"/>
-          <w:sz w:val="18"/>
-          <w:szCs w:val="18"/>
-          <w:shd w:val="clear" w:color="auto" w:fill="262626"/>
-        </w:rPr>
+        <w:t xml:space="preserve">к </w:t>
+      </w:r>
+      <w:r>
+        <w:t xml:space="preserve">договору </w:t>
+      </w:r>
+      <w:r>
+        <w:t xml:space="preserve">{raqam} </w:t>
+      </w:r>
+      <w:r>
+        <w:t>от</w:t>
+      </w:r>
+      <w:r>
         <w:t xml:space="preserve"> </w:t>
       </w:r>
       <w:r>
-        <w:rPr>
-          <w:rStyle w:val="apple-style-span"/>
-          <w:color w:val="000000"/>
-          <w:sz w:val="20"/>
-          <w:szCs w:val="20"/>
-        </w:rPr>
-        <w:t>от</w:t>
-      </w:r>
-      <w:r>
-        <w:rPr>
-          <w:rStyle w:val="apple-style-span"/>
-          <w:color w:val="000000"/>
-          <w:sz w:val="20"/>
-          <w:szCs w:val="20"/>
-        </w:rPr>
         <w:t xml:space="preserve"> </w:t>
       </w:r>
       <w:r>
-        <w:rPr>
-          <w:rStyle w:val="apple-style-span"/>
-          <w:color w:val="000000"/>
-          <w:sz w:val="20"/>
-          <w:szCs w:val="20"/>
-        </w:rPr>
-        <w:t xml:space="preserve"> </w:t>
-      </w:r>
-      <w:r>
-        <w:rPr>
-          <w:rFonts w:ascii="Courier New" w:hAnsi="Courier New" w:cs="Courier New"/>
-          <w:color w:val="8C8C8C"/>
-          <w:sz w:val="18"/>
-          <w:szCs w:val="18"/>
-          <w:shd w:val="clear" w:color="auto" w:fill="262626"/>
-        </w:rPr>
         <w:t>{sana}</w:t>
       </w:r>
       <w:r>
-        <w:rPr>
-          <w:rStyle w:val="apple-style-span"/>
-          <w:color w:val="000000"/>
-          <w:sz w:val="20"/>
-          <w:szCs w:val="20"/>
-          <w:highlight w:val="yellow"/>
-        </w:rPr>
         <w:t>г</w:t>
       </w:r>
       <w:r>
@@ -10671,16 +9983,12 @@
         <w:t xml:space="preserve"> </w:t>
       </w:r>
       <w:r>
-        <w:rPr>
-          <w:rFonts w:ascii="Courier New" w:hAnsi="Courier New" w:cs="Courier New"/>
-          <w:color w:val="8C8C8C"/>
-          <w:sz w:val="18"/>
-          <w:szCs w:val="18"/>
-          <w:shd w:val="clear" w:color="auto" w:fill="262626"/>
-        </w:rPr>
         <w:t>{manzil}</w:t>
       </w:r>
       <w:r>
+        <w:t>.</w:t>
+      </w:r>
+      <w:r>
         <w:rPr>
           <w:rStyle w:val="apple-style-span"/>
           <w:rFonts w:ascii="Times New Roman" w:hAnsi="Times New Roman"/>
@@ -10691,7 +9999,7 @@
           <w:szCs w:val="20"/>
           <w:lang w:val="uz-Cyrl-UZ"/>
         </w:rPr>
-        <w:t>.Куйичирчик райони</w:t>
+        <w:t>Куйичирчик райони</w:t>
       </w:r>
       <w:r>
         <w:rPr>
@@ -10790,22 +10098,9 @@
         <w:t xml:space="preserve">/09-24 от </w:t>
       </w:r>
       <w:r>
-        <w:rPr>
-          <w:rFonts w:ascii="Courier New" w:hAnsi="Courier New" w:cs="Courier New"/>
-          <w:color w:val="8C8C8C"/>
-          <w:sz w:val="18"/>
-          <w:szCs w:val="18"/>
-          <w:shd w:val="clear" w:color="auto" w:fill="262626"/>
-        </w:rPr>
         <w:t>{sana}</w:t>
       </w:r>
       <w:r>
-        <w:rPr>
-          <w:rStyle w:val="apple-style-span"/>
-          <w:color w:val="000000"/>
-          <w:sz w:val="20"/>
-          <w:szCs w:val="20"/>
-        </w:rPr>
         <w:t>г.</w:t>
       </w:r>
     </w:p>
@@ -11014,28 +10309,51 @@
       </w:r>
       <w:r>
         <w:rPr>
-          <w:rFonts w:ascii="Times New Roman" w:hAnsi="Times New Roman"/>
-          <w:b/>
-          <w:lang w:val="en-US" w:bidi="en-US"/>
-        </w:rPr>
-        <w:t>BLAGO</w:t>
-      </w:r>
-      <w:r>
-        <w:rPr>
-          <w:rFonts w:ascii="Times New Roman" w:hAnsi="Times New Roman"/>
-          <w:b/>
-          <w:lang w:bidi="en-US"/>
+          <w:b/>
+          <w:sz w:val="20"/>
+          <w:szCs w:val="20"/>
+          <w:lang w:val="en-US"/>
+        </w:rPr>
+        <w:t>MY</w:t>
+      </w:r>
+      <w:r>
+        <w:rPr>
+          <w:b/>
+          <w:sz w:val="20"/>
+          <w:szCs w:val="20"/>
+          <w:lang w:val="en-US"/>
         </w:rPr>
         <w:t xml:space="preserve"> </w:t>
       </w:r>
       <w:r>
         <w:rPr>
-          <w:rFonts w:ascii="Times New Roman" w:hAnsi="Times New Roman"/>
-          <w:b/>
-          <w:lang w:val="en-US" w:bidi="en-US"/>
-        </w:rPr>
-        <w:t>VSEM</w:t>
-      </w:r>
+          <w:b/>
+          <w:sz w:val="20"/>
+          <w:szCs w:val="20"/>
+          <w:lang w:val="en-US"/>
+        </w:rPr>
+        <w:t>PERFEKT</w:t>
+      </w:r>
+      <w:r>
+        <w:rPr>
+          <w:b/>
+          <w:sz w:val="20"/>
+          <w:szCs w:val="20"/>
+          <w:lang w:val="en-US"/>
+        </w:rPr>
+        <w:t xml:space="preserve"> </w:t>
+      </w:r>
+      <w:r>
+        <w:rPr>
+          <w:b/>
+          <w:sz w:val="20"/>
+          <w:szCs w:val="20"/>
+          <w:lang w:val="en-US"/>
+        </w:rPr>
+        <w:t>HOME</w:t>
+      </w:r>
+      <w:bookmarkStart w:id="0" w:name="_GoBack"/>
+      <w:bookmarkEnd w:id="0"/>
       <w:r>
         <w:rPr>
           <w:rFonts w:ascii="Times New Roman" w:hAnsi="Times New Roman"/>
@@ -11070,108 +10388,21 @@
       </w:pPr>
     </w:p>
     <w:p>
-      <w:pPr>
-        <w:tabs>
-          <w:tab w:val="left" w:pos="6209"/>
-        </w:tabs>
-        <w:spacing w:after="0"/>
-        <w:ind w:right="-284"/>
-        <w:rPr>
-          <w:rStyle w:val="apple-style-span"/>
-          <w:rFonts w:ascii="Times New Roman" w:hAnsi="Times New Roman"/>
-          <w:color w:val="000000"/>
-          <w:sz w:val="20"/>
-          <w:szCs w:val="20"/>
-          <w:lang w:val="uz-Cyrl-UZ"/>
-        </w:rPr>
-      </w:pPr>
-      <w:r>
-        <w:rPr>
-          <w:rStyle w:val="apple-style-span"/>
-          <w:rFonts w:ascii="Times New Roman" w:hAnsi="Times New Roman"/>
-          <w:color w:val="000000"/>
-          <w:sz w:val="20"/>
-          <w:szCs w:val="20"/>
-          <w:lang w:val="uz-Cyrl-UZ"/>
-        </w:rPr>
+      <w:r>
         <w:t xml:space="preserve">Директор                                                                                    </w:t>
       </w:r>
       <w:r>
-        <w:rPr>
-          <w:rStyle w:val="apple-style-span"/>
-          <w:rFonts w:ascii="Times New Roman" w:hAnsi="Times New Roman"/>
-          <w:color w:val="000000"/>
-          <w:sz w:val="20"/>
-          <w:szCs w:val="20"/>
-          <w:lang w:val="uz-Cyrl-UZ"/>
-        </w:rPr>
         <w:t xml:space="preserve">     </w:t>
       </w:r>
       <w:r>
-        <w:rPr>
-          <w:rStyle w:val="apple-style-span"/>
-          <w:rFonts w:ascii="Times New Roman" w:hAnsi="Times New Roman"/>
-          <w:color w:val="000000"/>
-          <w:sz w:val="20"/>
-          <w:szCs w:val="20"/>
-        </w:rPr>
         <w:t xml:space="preserve">     </w:t>
       </w:r>
       <w:r>
-        <w:rPr>
-          <w:rStyle w:val="apple-style-span"/>
-          <w:rFonts w:ascii="Times New Roman" w:hAnsi="Times New Roman"/>
-          <w:color w:val="000000"/>
-          <w:sz w:val="20"/>
-          <w:szCs w:val="20"/>
-          <w:lang w:val="uz-Cyrl-UZ"/>
-        </w:rPr>
         <w:t xml:space="preserve">   </w:t>
       </w:r>
       <w:r>
-        <w:rPr>
-          <w:rFonts w:ascii="Courier New" w:hAnsi="Courier New" w:cs="Courier New"/>
-          <w:color w:val="8C8C8C"/>
-          <w:sz w:val="18"/>
-          <w:szCs w:val="18"/>
-          <w:shd w:val="clear" w:color="auto" w:fill="262626"/>
-        </w:rPr>
         <w:t>{ism}</w:t>
       </w:r>
-    </w:p>
-    <w:p>
-      <w:pPr>
-        <w:tabs>
-          <w:tab w:val="left" w:pos="6209"/>
-        </w:tabs>
-        <w:spacing w:after="0"/>
-        <w:ind w:right="-284"/>
-        <w:rPr>
-          <w:rStyle w:val="apple-style-span"/>
-          <w:rFonts w:ascii="Times New Roman" w:hAnsi="Times New Roman"/>
-          <w:color w:val="000000"/>
-          <w:sz w:val="16"/>
-          <w:szCs w:val="16"/>
-          <w:highlight w:val="yellow"/>
-          <w:lang w:val="uz-Cyrl-UZ"/>
-        </w:rPr>
-      </w:pPr>
-    </w:p>
-    <w:p>
-      <w:pPr>
-        <w:tabs>
-          <w:tab w:val="left" w:pos="6209"/>
-        </w:tabs>
-        <w:spacing w:after="0"/>
-        <w:ind w:right="-284"/>
-        <w:jc w:val="center"/>
-        <w:rPr>
-          <w:rFonts w:ascii="Times New Roman" w:hAnsi="Times New Roman"/>
-          <w:sz w:val="16"/>
-          <w:szCs w:val="16"/>
-          <w:lang w:val="uz-Cyrl-UZ"/>
-        </w:rPr>
-      </w:pPr>
     </w:p>
     <w:p>
       <w:pPr>
@@ -13020,7 +12251,7 @@
 </file>
 
 <file path=customXml/itemProps1.xml><?xml version="1.0" encoding="utf-8"?>
-<ds:datastoreItem xmlns:ds="http://schemas.openxmlformats.org/officeDocument/2006/customXml" ds:itemID="{3206947C-538C-468E-9018-20EE0A3B1FA1}">
+<ds:datastoreItem xmlns:ds="http://schemas.openxmlformats.org/officeDocument/2006/customXml" ds:itemID="{51CA1F0F-4C6A-4E9C-9433-120BCCC3A37D}">
   <ds:schemaRefs>
     <ds:schemaRef ds:uri="http://schemas.openxmlformats.org/officeDocument/2006/bibliography"/>
   </ds:schemaRefs>

</xml_diff>